<commit_message>
Gestion des @todo et erreurs
</commit_message>
<xml_diff>
--- a/doc/NotesNRa6_vérifications_et_cas_particuliers.docx
+++ b/doc/NotesNRa6_vérifications_et_cas_particuliers.docx
@@ -100,31 +100,7 @@
       </w:r>
       <w:proofErr w:type="gramEnd"/>
       <w:r>
-        <w:t xml:space="preserve"> id="</w:t>
-      </w:r>
-      <w:proofErr w:type="spellStart"/>
-      <w:r>
-        <w:t>person-title</w:t>
-      </w:r>
-      <w:proofErr w:type="spellEnd"/>
-      <w:r>
-        <w:t>" class="</w:t>
-      </w:r>
-      <w:proofErr w:type="spellStart"/>
-      <w:r>
-        <w:t>row</w:t>
-      </w:r>
-      <w:proofErr w:type="spellEnd"/>
-      <w:r>
-        <w:t xml:space="preserve"> </w:t>
-      </w:r>
-      <w:proofErr w:type="spellStart"/>
-      <w:r>
-        <w:t>clearfix</w:t>
-      </w:r>
-      <w:proofErr w:type="spellEnd"/>
-      <w:r>
-        <w:t>"&gt;</w:t>
+        <w:t xml:space="preserve"> id="person-title" class="row clearfix"&gt;</w:t>
       </w:r>
     </w:p>
     <w:p>
@@ -140,15 +116,7 @@
       </w:r>
       <w:proofErr w:type="gramEnd"/>
       <w:r>
-        <w:t xml:space="preserve"> class="</w:t>
-      </w:r>
-      <w:proofErr w:type="spellStart"/>
-      <w:r>
-        <w:t>columns</w:t>
-      </w:r>
-      <w:proofErr w:type="spellEnd"/>
-      <w:r>
-        <w:t>"&gt;</w:t>
+        <w:t xml:space="preserve"> class="columns"&gt;</w:t>
       </w:r>
     </w:p>
     <w:p>
@@ -164,23 +132,7 @@
       </w:r>
       <w:proofErr w:type="gramEnd"/>
       <w:r>
-        <w:t>1 class="</w:t>
-      </w:r>
-      <w:proofErr w:type="spellStart"/>
-      <w:r>
-        <w:t>with_tabs</w:t>
-      </w:r>
-      <w:proofErr w:type="spellEnd"/>
-      <w:r>
-        <w:t xml:space="preserve"> </w:t>
-      </w:r>
-      <w:proofErr w:type="spellStart"/>
-      <w:r>
-        <w:t>name</w:t>
-      </w:r>
-      <w:proofErr w:type="spellEnd"/>
-      <w:r>
-        <w:t>"&gt;</w:t>
+        <w:t>1 class="with_tabs name"&gt;</w:t>
       </w:r>
     </w:p>
     <w:p>
@@ -190,31 +142,13 @@
       <w:r>
         <w:t>&lt;</w:t>
       </w:r>
-      <w:proofErr w:type="spellStart"/>
       <w:proofErr w:type="gramStart"/>
       <w:r>
         <w:t>img</w:t>
       </w:r>
-      <w:proofErr w:type="spellEnd"/>
-      <w:proofErr w:type="gramEnd"/>
-      <w:r>
-        <w:t xml:space="preserve"> src="images/male.png" alt="H" </w:t>
-      </w:r>
-      <w:proofErr w:type="spellStart"/>
-      <w:r>
-        <w:t>title</w:t>
-      </w:r>
-      <w:proofErr w:type="spellEnd"/>
-      <w:r>
-        <w:t>="H"&gt;&amp;</w:t>
-      </w:r>
-      <w:proofErr w:type="spellStart"/>
-      <w:r>
-        <w:t>nbsp</w:t>
-      </w:r>
-      <w:proofErr w:type="spellEnd"/>
-      <w:r>
-        <w:t>;</w:t>
+      <w:proofErr w:type="gramEnd"/>
+      <w:r>
+        <w:t xml:space="preserve"> src="images/male.png" alt="H" title="H"&gt;&amp;nbsp;</w:t>
       </w:r>
     </w:p>
     <w:p>
@@ -230,23 +164,7 @@
       </w:r>
       <w:proofErr w:type="gramEnd"/>
       <w:r>
-        <w:t xml:space="preserve"> href="danielr13?lang=</w:t>
-      </w:r>
-      <w:proofErr w:type="spellStart"/>
-      <w:r>
-        <w:t>fr&amp;m</w:t>
-      </w:r>
-      <w:proofErr w:type="spellEnd"/>
-      <w:r>
-        <w:t>=</w:t>
-      </w:r>
-      <w:proofErr w:type="spellStart"/>
-      <w:r>
-        <w:t>P&amp;v</w:t>
-      </w:r>
-      <w:proofErr w:type="spellEnd"/>
-      <w:r>
-        <w:t>=pierre"&gt;Pierre&lt;/a&gt;</w:t>
+        <w:t xml:space="preserve"> href="danielr13?lang=fr&amp;m=P&amp;v=pierre"&gt;Pierre&lt;/a&gt;</w:t>
       </w:r>
     </w:p>
     <w:p>
@@ -262,31 +180,7 @@
       </w:r>
       <w:proofErr w:type="gramEnd"/>
       <w:r>
-        <w:t xml:space="preserve"> href="danielr13?lang=</w:t>
-      </w:r>
-      <w:proofErr w:type="spellStart"/>
-      <w:r>
-        <w:t>fr&amp;m</w:t>
-      </w:r>
-      <w:proofErr w:type="spellEnd"/>
-      <w:r>
-        <w:t>=</w:t>
-      </w:r>
-      <w:proofErr w:type="spellStart"/>
-      <w:r>
-        <w:t>N&amp;v</w:t>
-      </w:r>
-      <w:proofErr w:type="spellEnd"/>
-      <w:r>
-        <w:t>=</w:t>
-      </w:r>
-      <w:proofErr w:type="spellStart"/>
-      <w:r>
-        <w:t>nicolas</w:t>
-      </w:r>
-      <w:proofErr w:type="spellEnd"/>
-      <w:r>
-        <w:t>"&gt;NICOLAS&lt;/a&gt;</w:t>
+        <w:t xml:space="preserve"> href="danielr13?lang=fr&amp;m=N&amp;v=nicolas"&gt;NICOLAS&lt;/a&gt;</w:t>
       </w:r>
     </w:p>
     <w:p>
@@ -310,15 +204,7 @@
       </w:r>
       <w:proofErr w:type="gramEnd"/>
       <w:r>
-        <w:t xml:space="preserve"> class="action-buttons not-</w:t>
-      </w:r>
-      <w:proofErr w:type="spellStart"/>
-      <w:r>
-        <w:t>printable</w:t>
-      </w:r>
-      <w:proofErr w:type="spellEnd"/>
-      <w:r>
-        <w:t>"&gt;</w:t>
+        <w:t xml:space="preserve"> class="action-buttons not-printable"&gt;</w:t>
       </w:r>
     </w:p>
     <w:p>
@@ -357,21 +243,43 @@
       <w:r>
         <w:t>&lt;</w:t>
       </w:r>
-      <w:proofErr w:type="spellStart"/>
       <w:proofErr w:type="gramStart"/>
       <w:r>
         <w:t>em</w:t>
       </w:r>
-      <w:proofErr w:type="spellEnd"/>
-      <w:proofErr w:type="gramEnd"/>
-      <w:r>
-        <w:t>&gt;(Pierre Jean Baptiste NICOLAS)&lt;/</w:t>
-      </w:r>
-      <w:proofErr w:type="spellStart"/>
-      <w:r>
-        <w:t>em</w:t>
-      </w:r>
-      <w:proofErr w:type="spellEnd"/>
+      <w:proofErr w:type="gramEnd"/>
+      <w:r>
+        <w:t>&gt;(Pierre Jean Baptiste NICOLAS)&lt;/em&gt;</w:t>
+      </w:r>
+    </w:p>
+    <w:p>
+      <w:pPr>
+        <w:pStyle w:val="Listing"/>
+      </w:pPr>
+      <w:r>
+        <w:t>&lt;</w:t>
+      </w:r>
+      <w:proofErr w:type="gramStart"/>
+      <w:r>
+        <w:t>br</w:t>
+      </w:r>
+      <w:proofErr w:type="gramEnd"/>
+      <w:r>
+        <w:t>&gt;&lt;br class="separateur"&gt;&lt;br &gt;</w:t>
+      </w:r>
+    </w:p>
+    <w:p>
+      <w:pPr>
+        <w:pStyle w:val="Listing"/>
+      </w:pPr>
+      <w:r>
+        <w:t>&lt;</w:t>
+      </w:r>
+      <w:proofErr w:type="gramStart"/>
+      <w:r>
+        <w:t>ul</w:t>
+      </w:r>
+      <w:proofErr w:type="gramEnd"/>
       <w:r>
         <w:t>&gt;</w:t>
       </w:r>
@@ -383,39 +291,13 @@
       <w:r>
         <w:t>&lt;</w:t>
       </w:r>
-      <w:proofErr w:type="spellStart"/>
-      <w:proofErr w:type="gramStart"/>
-      <w:r>
-        <w:t>br</w:t>
-      </w:r>
-      <w:proofErr w:type="spellEnd"/>
-      <w:proofErr w:type="gramEnd"/>
-      <w:r>
-        <w:t>&gt;&lt;</w:t>
-      </w:r>
-      <w:proofErr w:type="spellStart"/>
-      <w:r>
-        <w:t>br</w:t>
-      </w:r>
-      <w:proofErr w:type="spellEnd"/>
-      <w:r>
-        <w:t xml:space="preserve"> class="</w:t>
-      </w:r>
-      <w:proofErr w:type="spellStart"/>
-      <w:r>
-        <w:t>separateur</w:t>
-      </w:r>
-      <w:proofErr w:type="spellEnd"/>
-      <w:r>
-        <w:t>"&gt;&lt;</w:t>
-      </w:r>
-      <w:proofErr w:type="spellStart"/>
-      <w:r>
-        <w:t>br</w:t>
-      </w:r>
-      <w:proofErr w:type="spellEnd"/>
-      <w:r>
-        <w:t xml:space="preserve"> &gt;</w:t>
+      <w:proofErr w:type="gramStart"/>
+      <w:r>
+        <w:t>li</w:t>
+      </w:r>
+      <w:proofErr w:type="gramEnd"/>
+      <w:r>
+        <w:t>&gt;Né le&amp;nbsp;31&amp;nbsp;janvier&amp;nbsp;1821 (mercredi) - Boulbon (13017)&lt;/li&gt;</w:t>
       </w:r>
     </w:p>
     <w:p>
@@ -425,15 +307,26 @@
       <w:r>
         <w:t>&lt;</w:t>
       </w:r>
-      <w:proofErr w:type="spellStart"/>
-      <w:proofErr w:type="gramStart"/>
-      <w:r>
-        <w:t>ul</w:t>
-      </w:r>
-      <w:proofErr w:type="spellEnd"/>
-      <w:proofErr w:type="gramEnd"/>
-      <w:r>
-        <w:t>&gt;</w:t>
+      <w:proofErr w:type="gramStart"/>
+      <w:r>
+        <w:t>li</w:t>
+      </w:r>
+      <w:proofErr w:type="gramEnd"/>
+      <w:r>
+        <w:t>&gt;Décédé le&amp;nbsp;24&amp;nbsp;mars&amp;nbsp;1890 (lundi) - Boulbon (13017),</w:t>
+      </w:r>
+    </w:p>
+    <w:p>
+      <w:pPr>
+        <w:pStyle w:val="Listing"/>
+      </w:pPr>
+      <w:proofErr w:type="gramStart"/>
+      <w:r>
+        <w:t>à</w:t>
+      </w:r>
+      <w:proofErr w:type="gramEnd"/>
+      <w:r>
+        <w:t xml:space="preserve"> l'âge de 69 ans&lt;/li&gt;</w:t>
       </w:r>
     </w:p>
     <w:p>
@@ -449,51 +342,6 @@
       </w:r>
       <w:proofErr w:type="gramEnd"/>
       <w:r>
-        <w:t>&gt;Né le&amp;nbsp;31&amp;nbsp;janvier&amp;nbsp;1821 (mercredi) - Boulbon (13017)&lt;/li&gt;</w:t>
-      </w:r>
-    </w:p>
-    <w:p>
-      <w:pPr>
-        <w:pStyle w:val="Listing"/>
-      </w:pPr>
-      <w:r>
-        <w:t>&lt;</w:t>
-      </w:r>
-      <w:proofErr w:type="gramStart"/>
-      <w:r>
-        <w:t>li</w:t>
-      </w:r>
-      <w:proofErr w:type="gramEnd"/>
-      <w:r>
-        <w:t>&gt;Décédé le&amp;nbsp;24&amp;nbsp;mars&amp;nbsp;1890 (lundi) - Boulbon (13017),</w:t>
-      </w:r>
-    </w:p>
-    <w:p>
-      <w:pPr>
-        <w:pStyle w:val="Listing"/>
-      </w:pPr>
-      <w:proofErr w:type="gramStart"/>
-      <w:r>
-        <w:t>à</w:t>
-      </w:r>
-      <w:proofErr w:type="gramEnd"/>
-      <w:r>
-        <w:t xml:space="preserve"> l'âge de 69 ans&lt;/li&gt;</w:t>
-      </w:r>
-    </w:p>
-    <w:p>
-      <w:pPr>
-        <w:pStyle w:val="Listing"/>
-      </w:pPr>
-      <w:r>
-        <w:t>&lt;</w:t>
-      </w:r>
-      <w:proofErr w:type="gramStart"/>
-      <w:r>
-        <w:t>li</w:t>
-      </w:r>
-      <w:proofErr w:type="gramEnd"/>
-      <w:r>
         <w:t>&gt;Agriculteur&lt;/li&gt;</w:t>
       </w:r>
     </w:p>
@@ -502,15 +350,7 @@
         <w:pStyle w:val="Listing"/>
       </w:pPr>
       <w:r>
-        <w:t>&lt;/</w:t>
-      </w:r>
-      <w:proofErr w:type="spellStart"/>
-      <w:r>
-        <w:t>ul</w:t>
-      </w:r>
-      <w:proofErr w:type="spellEnd"/>
-      <w:r>
-        <w:t>&gt;</w:t>
+        <w:t>&lt;/ul&gt;</w:t>
       </w:r>
     </w:p>
     <w:p/>
@@ -592,31 +432,7 @@
       </w:r>
       <w:proofErr w:type="gramEnd"/>
       <w:r>
-        <w:t xml:space="preserve"> id="</w:t>
-      </w:r>
-      <w:proofErr w:type="spellStart"/>
-      <w:r>
-        <w:t>person-title</w:t>
-      </w:r>
-      <w:proofErr w:type="spellEnd"/>
-      <w:r>
-        <w:t>" class="</w:t>
-      </w:r>
-      <w:proofErr w:type="spellStart"/>
-      <w:r>
-        <w:t>row</w:t>
-      </w:r>
-      <w:proofErr w:type="spellEnd"/>
-      <w:r>
-        <w:t xml:space="preserve"> </w:t>
-      </w:r>
-      <w:proofErr w:type="spellStart"/>
-      <w:r>
-        <w:t>clearfix</w:t>
-      </w:r>
-      <w:proofErr w:type="spellEnd"/>
-      <w:r>
-        <w:t>"&gt;</w:t>
+        <w:t xml:space="preserve"> id="person-title" class="row clearfix"&gt;</w:t>
       </w:r>
     </w:p>
     <w:p>
@@ -632,15 +448,7 @@
       </w:r>
       <w:proofErr w:type="gramEnd"/>
       <w:r>
-        <w:t xml:space="preserve"> class="</w:t>
-      </w:r>
-      <w:proofErr w:type="spellStart"/>
-      <w:r>
-        <w:t>columns</w:t>
-      </w:r>
-      <w:proofErr w:type="spellEnd"/>
-      <w:r>
-        <w:t>"&gt;</w:t>
+        <w:t xml:space="preserve"> class="columns"&gt;</w:t>
       </w:r>
     </w:p>
     <w:p>
@@ -656,23 +464,7 @@
       </w:r>
       <w:proofErr w:type="gramEnd"/>
       <w:r>
-        <w:t>1 class="</w:t>
-      </w:r>
-      <w:proofErr w:type="spellStart"/>
-      <w:r>
-        <w:t>with_tabs</w:t>
-      </w:r>
-      <w:proofErr w:type="spellEnd"/>
-      <w:r>
-        <w:t xml:space="preserve"> </w:t>
-      </w:r>
-      <w:proofErr w:type="spellStart"/>
-      <w:r>
-        <w:t>name</w:t>
-      </w:r>
-      <w:proofErr w:type="spellEnd"/>
-      <w:r>
-        <w:t>"&gt;</w:t>
+        <w:t>1 class="with_tabs name"&gt;</w:t>
       </w:r>
     </w:p>
     <w:p>
@@ -682,31 +474,13 @@
       <w:r>
         <w:t>&lt;</w:t>
       </w:r>
-      <w:proofErr w:type="spellStart"/>
       <w:proofErr w:type="gramStart"/>
       <w:r>
         <w:t>img</w:t>
       </w:r>
-      <w:proofErr w:type="spellEnd"/>
-      <w:proofErr w:type="gramEnd"/>
-      <w:r>
-        <w:t xml:space="preserve"> src="images/male.png" alt="H" </w:t>
-      </w:r>
-      <w:proofErr w:type="spellStart"/>
-      <w:r>
-        <w:t>title</w:t>
-      </w:r>
-      <w:proofErr w:type="spellEnd"/>
-      <w:r>
-        <w:t>="H"&gt;&amp;</w:t>
-      </w:r>
-      <w:proofErr w:type="spellStart"/>
-      <w:r>
-        <w:t>nbsp</w:t>
-      </w:r>
-      <w:proofErr w:type="spellEnd"/>
-      <w:r>
-        <w:t>;</w:t>
+      <w:proofErr w:type="gramEnd"/>
+      <w:r>
+        <w:t xml:space="preserve"> src="images/male.png" alt="H" title="H"&gt;&amp;nbsp;</w:t>
       </w:r>
     </w:p>
     <w:p>
@@ -722,31 +496,7 @@
       </w:r>
       <w:proofErr w:type="gramEnd"/>
       <w:r>
-        <w:t xml:space="preserve"> href="danielr13?lang=</w:t>
-      </w:r>
-      <w:proofErr w:type="spellStart"/>
-      <w:r>
-        <w:t>fr&amp;m</w:t>
-      </w:r>
-      <w:proofErr w:type="spellEnd"/>
-      <w:r>
-        <w:t>=</w:t>
-      </w:r>
-      <w:proofErr w:type="spellStart"/>
-      <w:r>
-        <w:t>P&amp;v</w:t>
-      </w:r>
-      <w:proofErr w:type="spellEnd"/>
-      <w:r>
-        <w:t>=</w:t>
-      </w:r>
-      <w:proofErr w:type="spellStart"/>
-      <w:r>
-        <w:t>marcellin</w:t>
-      </w:r>
-      <w:proofErr w:type="spellEnd"/>
-      <w:r>
-        <w:t>"&gt;Marcellin&lt;/a&gt;</w:t>
+        <w:t xml:space="preserve"> href="danielr13?lang=fr&amp;m=P&amp;v=marcellin"&gt;Marcellin&lt;/a&gt;</w:t>
       </w:r>
     </w:p>
     <w:p>
@@ -762,23 +512,7 @@
       </w:r>
       <w:proofErr w:type="gramEnd"/>
       <w:r>
-        <w:t xml:space="preserve"> href="danielr13?lang=</w:t>
-      </w:r>
-      <w:proofErr w:type="spellStart"/>
-      <w:r>
-        <w:t>fr&amp;m</w:t>
-      </w:r>
-      <w:proofErr w:type="spellEnd"/>
-      <w:r>
-        <w:t>=</w:t>
-      </w:r>
-      <w:proofErr w:type="spellStart"/>
-      <w:r>
-        <w:t>N&amp;v</w:t>
-      </w:r>
-      <w:proofErr w:type="spellEnd"/>
-      <w:r>
-        <w:t>=gilles"&gt;GILLES&lt;/a&gt;</w:t>
+        <w:t xml:space="preserve"> href="danielr13?lang=fr&amp;m=N&amp;v=gilles"&gt;GILLES&lt;/a&gt;</w:t>
       </w:r>
     </w:p>
     <w:p>
@@ -802,15 +536,7 @@
       </w:r>
       <w:proofErr w:type="gramEnd"/>
       <w:r>
-        <w:t xml:space="preserve"> class="action-buttons not-</w:t>
-      </w:r>
-      <w:proofErr w:type="spellStart"/>
-      <w:r>
-        <w:t>printable</w:t>
-      </w:r>
-      <w:proofErr w:type="spellEnd"/>
-      <w:r>
-        <w:t>"&gt;</w:t>
+        <w:t xml:space="preserve"> class="action-buttons not-printable"&gt;</w:t>
       </w:r>
     </w:p>
     <w:p>
@@ -852,7 +578,6 @@
         </w:rPr>
         <w:t>&lt;</w:t>
       </w:r>
-      <w:proofErr w:type="spellStart"/>
       <w:proofErr w:type="gramStart"/>
       <w:r>
         <w:rPr>
@@ -860,26 +585,43 @@
         </w:rPr>
         <w:t>em</w:t>
       </w:r>
-      <w:proofErr w:type="spellEnd"/>
       <w:proofErr w:type="gramEnd"/>
       <w:r>
         <w:rPr>
           <w:highlight w:val="yellow"/>
         </w:rPr>
-        <w:t>&gt;(né Maximin GILLES)&lt;/</w:t>
-      </w:r>
-      <w:proofErr w:type="spellStart"/>
-      <w:r>
-        <w:rPr>
-          <w:highlight w:val="yellow"/>
-        </w:rPr>
-        <w:t>em</w:t>
-      </w:r>
-      <w:proofErr w:type="spellEnd"/>
-      <w:r>
-        <w:rPr>
-          <w:highlight w:val="yellow"/>
-        </w:rPr>
+        <w:t>&gt;(né Maximin GILLES)&lt;/em&gt;</w:t>
+      </w:r>
+    </w:p>
+    <w:p>
+      <w:pPr>
+        <w:pStyle w:val="Listing"/>
+      </w:pPr>
+      <w:r>
+        <w:t>&lt;</w:t>
+      </w:r>
+      <w:proofErr w:type="gramStart"/>
+      <w:r>
+        <w:t>br</w:t>
+      </w:r>
+      <w:proofErr w:type="gramEnd"/>
+      <w:r>
+        <w:t>&gt;&lt;br class="separateur"&gt;&lt;br &gt;</w:t>
+      </w:r>
+    </w:p>
+    <w:p>
+      <w:pPr>
+        <w:pStyle w:val="Listing"/>
+      </w:pPr>
+      <w:r>
+        <w:t>&lt;</w:t>
+      </w:r>
+      <w:proofErr w:type="gramStart"/>
+      <w:r>
+        <w:t>ul</w:t>
+      </w:r>
+      <w:proofErr w:type="gramEnd"/>
+      <w:r>
         <w:t>&gt;</w:t>
       </w:r>
     </w:p>
@@ -890,39 +632,13 @@
       <w:r>
         <w:t>&lt;</w:t>
       </w:r>
-      <w:proofErr w:type="spellStart"/>
-      <w:proofErr w:type="gramStart"/>
-      <w:r>
-        <w:t>br</w:t>
-      </w:r>
-      <w:proofErr w:type="spellEnd"/>
-      <w:proofErr w:type="gramEnd"/>
-      <w:r>
-        <w:t>&gt;&lt;</w:t>
-      </w:r>
-      <w:proofErr w:type="spellStart"/>
-      <w:r>
-        <w:t>br</w:t>
-      </w:r>
-      <w:proofErr w:type="spellEnd"/>
-      <w:r>
-        <w:t xml:space="preserve"> class="</w:t>
-      </w:r>
-      <w:proofErr w:type="spellStart"/>
-      <w:r>
-        <w:t>separateur</w:t>
-      </w:r>
-      <w:proofErr w:type="spellEnd"/>
-      <w:r>
-        <w:t>"&gt;&lt;</w:t>
-      </w:r>
-      <w:proofErr w:type="spellStart"/>
-      <w:r>
-        <w:t>br</w:t>
-      </w:r>
-      <w:proofErr w:type="spellEnd"/>
-      <w:r>
-        <w:t xml:space="preserve"> &gt;</w:t>
+      <w:proofErr w:type="gramStart"/>
+      <w:r>
+        <w:t>li</w:t>
+      </w:r>
+      <w:proofErr w:type="gramEnd"/>
+      <w:r>
+        <w:t>&gt;Né le&amp;nbsp;1er&amp;nbsp;juin&amp;nbsp;1749 (dimanche) - Boulbon (13017)&lt;/li&gt;</w:t>
       </w:r>
     </w:p>
     <w:p>
@@ -932,46 +648,12 @@
       <w:r>
         <w:t>&lt;</w:t>
       </w:r>
-      <w:proofErr w:type="spellStart"/>
-      <w:proofErr w:type="gramStart"/>
-      <w:r>
-        <w:t>ul</w:t>
-      </w:r>
-      <w:proofErr w:type="spellEnd"/>
-      <w:proofErr w:type="gramEnd"/>
-      <w:r>
-        <w:t>&gt;</w:t>
-      </w:r>
-    </w:p>
-    <w:p>
-      <w:pPr>
-        <w:pStyle w:val="Listing"/>
-      </w:pPr>
-      <w:r>
-        <w:t>&lt;</w:t>
-      </w:r>
       <w:proofErr w:type="gramStart"/>
       <w:r>
         <w:t>li</w:t>
       </w:r>
       <w:proofErr w:type="gramEnd"/>
       <w:r>
-        <w:t>&gt;Né le&amp;nbsp;1er&amp;nbsp;juin&amp;nbsp;1749 (dimanche) - Boulbon (13017)&lt;/li&gt;</w:t>
-      </w:r>
-    </w:p>
-    <w:p>
-      <w:pPr>
-        <w:pStyle w:val="Listing"/>
-      </w:pPr>
-      <w:r>
-        <w:t>&lt;</w:t>
-      </w:r>
-      <w:proofErr w:type="gramStart"/>
-      <w:r>
-        <w:t>li</w:t>
-      </w:r>
-      <w:proofErr w:type="gramEnd"/>
-      <w:r>
         <w:t>&gt;Décédé le&amp;nbsp;10&amp;nbsp;septembre&amp;nbsp;1832 (lundi) - Boulbon (13017),</w:t>
       </w:r>
     </w:p>
@@ -993,15 +675,7 @@
         <w:pStyle w:val="Listing"/>
       </w:pPr>
       <w:r>
-        <w:t>&lt;/</w:t>
-      </w:r>
-      <w:proofErr w:type="spellStart"/>
-      <w:r>
-        <w:t>ul</w:t>
-      </w:r>
-      <w:proofErr w:type="spellEnd"/>
-      <w:r>
-        <w:t>&gt;</w:t>
+        <w:t>&lt;/ul&gt;</w:t>
       </w:r>
     </w:p>
     <w:p/>
@@ -1084,31 +758,7 @@
       </w:r>
       <w:proofErr w:type="gramEnd"/>
       <w:r>
-        <w:t xml:space="preserve"> id="</w:t>
-      </w:r>
-      <w:proofErr w:type="spellStart"/>
-      <w:r>
-        <w:t>person-title</w:t>
-      </w:r>
-      <w:proofErr w:type="spellEnd"/>
-      <w:r>
-        <w:t>" class="</w:t>
-      </w:r>
-      <w:proofErr w:type="spellStart"/>
-      <w:r>
-        <w:t>row</w:t>
-      </w:r>
-      <w:proofErr w:type="spellEnd"/>
-      <w:r>
-        <w:t xml:space="preserve"> </w:t>
-      </w:r>
-      <w:proofErr w:type="spellStart"/>
-      <w:r>
-        <w:t>clearfix</w:t>
-      </w:r>
-      <w:proofErr w:type="spellEnd"/>
-      <w:r>
-        <w:t>"&gt;</w:t>
+        <w:t xml:space="preserve"> id="person-title" class="row clearfix"&gt;</w:t>
       </w:r>
     </w:p>
     <w:p>
@@ -1124,15 +774,7 @@
       </w:r>
       <w:proofErr w:type="gramEnd"/>
       <w:r>
-        <w:t xml:space="preserve"> class="</w:t>
-      </w:r>
-      <w:proofErr w:type="spellStart"/>
-      <w:r>
-        <w:t>columns</w:t>
-      </w:r>
-      <w:proofErr w:type="spellEnd"/>
-      <w:r>
-        <w:t>"&gt;</w:t>
+        <w:t xml:space="preserve"> class="columns"&gt;</w:t>
       </w:r>
     </w:p>
     <w:p>
@@ -1148,23 +790,7 @@
       </w:r>
       <w:proofErr w:type="gramEnd"/>
       <w:r>
-        <w:t>1 class="</w:t>
-      </w:r>
-      <w:proofErr w:type="spellStart"/>
-      <w:r>
-        <w:t>with_tabs</w:t>
-      </w:r>
-      <w:proofErr w:type="spellEnd"/>
-      <w:r>
-        <w:t xml:space="preserve"> </w:t>
-      </w:r>
-      <w:proofErr w:type="spellStart"/>
-      <w:r>
-        <w:t>name</w:t>
-      </w:r>
-      <w:proofErr w:type="spellEnd"/>
-      <w:r>
-        <w:t>"&gt;</w:t>
+        <w:t>1 class="with_tabs name"&gt;</w:t>
       </w:r>
     </w:p>
     <w:p>
@@ -1174,31 +800,13 @@
       <w:r>
         <w:t>&lt;</w:t>
       </w:r>
-      <w:proofErr w:type="spellStart"/>
       <w:proofErr w:type="gramStart"/>
       <w:r>
         <w:t>img</w:t>
       </w:r>
-      <w:proofErr w:type="spellEnd"/>
-      <w:proofErr w:type="gramEnd"/>
-      <w:r>
-        <w:t xml:space="preserve"> src="images/male.png" alt="H" </w:t>
-      </w:r>
-      <w:proofErr w:type="spellStart"/>
-      <w:r>
-        <w:t>title</w:t>
-      </w:r>
-      <w:proofErr w:type="spellEnd"/>
-      <w:r>
-        <w:t>="H"&gt;&amp;</w:t>
-      </w:r>
-      <w:proofErr w:type="spellStart"/>
-      <w:r>
-        <w:t>nbsp</w:t>
-      </w:r>
-      <w:proofErr w:type="spellEnd"/>
-      <w:r>
-        <w:t>;</w:t>
+      <w:proofErr w:type="gramEnd"/>
+      <w:r>
+        <w:t xml:space="preserve"> src="images/male.png" alt="H" title="H"&gt;&amp;nbsp;</w:t>
       </w:r>
     </w:p>
     <w:p>
@@ -1214,23 +822,7 @@
       </w:r>
       <w:proofErr w:type="gramEnd"/>
       <w:r>
-        <w:t xml:space="preserve"> href="danielr13?lang=</w:t>
-      </w:r>
-      <w:proofErr w:type="spellStart"/>
-      <w:r>
-        <w:t>fr&amp;m</w:t>
-      </w:r>
-      <w:proofErr w:type="spellEnd"/>
-      <w:r>
-        <w:t>=</w:t>
-      </w:r>
-      <w:proofErr w:type="spellStart"/>
-      <w:r>
-        <w:t>P&amp;v</w:t>
-      </w:r>
-      <w:proofErr w:type="spellEnd"/>
-      <w:r>
-        <w:t>=jean"&gt;Jean&lt;/a&gt;</w:t>
+        <w:t xml:space="preserve"> href="danielr13?lang=fr&amp;m=P&amp;v=jean"&gt;Jean&lt;/a&gt;</w:t>
       </w:r>
     </w:p>
     <w:p>
@@ -1246,31 +838,7 @@
       </w:r>
       <w:proofErr w:type="gramEnd"/>
       <w:r>
-        <w:t xml:space="preserve"> href="danielr13?lang=</w:t>
-      </w:r>
-      <w:proofErr w:type="spellStart"/>
-      <w:r>
-        <w:t>fr&amp;m</w:t>
-      </w:r>
-      <w:proofErr w:type="spellEnd"/>
-      <w:r>
-        <w:t>=</w:t>
-      </w:r>
-      <w:proofErr w:type="spellStart"/>
-      <w:r>
-        <w:t>N&amp;v</w:t>
-      </w:r>
-      <w:proofErr w:type="spellEnd"/>
-      <w:r>
-        <w:t>=</w:t>
-      </w:r>
-      <w:proofErr w:type="spellStart"/>
-      <w:r>
-        <w:t>berlandier</w:t>
-      </w:r>
-      <w:proofErr w:type="spellEnd"/>
-      <w:r>
-        <w:t>"&gt;BERLANDIER&lt;/a&gt;</w:t>
+        <w:t xml:space="preserve"> href="danielr13?lang=fr&amp;m=N&amp;v=berlandier"&gt;BERLANDIER&lt;/a&gt;</w:t>
       </w:r>
     </w:p>
     <w:p>
@@ -1294,15 +862,7 @@
       </w:r>
       <w:proofErr w:type="gramEnd"/>
       <w:r>
-        <w:t xml:space="preserve"> class="action-buttons not-</w:t>
-      </w:r>
-      <w:proofErr w:type="spellStart"/>
-      <w:r>
-        <w:t>printable</w:t>
-      </w:r>
-      <w:proofErr w:type="spellEnd"/>
-      <w:r>
-        <w:t>"&gt;</w:t>
+        <w:t xml:space="preserve"> class="action-buttons not-printable"&gt;</w:t>
       </w:r>
     </w:p>
     <w:p>
@@ -1344,7 +904,6 @@
         </w:rPr>
         <w:t>&lt;</w:t>
       </w:r>
-      <w:proofErr w:type="spellStart"/>
       <w:proofErr w:type="gramStart"/>
       <w:r>
         <w:rPr>
@@ -1352,26 +911,43 @@
         </w:rPr>
         <w:t>em</w:t>
       </w:r>
-      <w:proofErr w:type="spellEnd"/>
       <w:proofErr w:type="gramEnd"/>
       <w:r>
         <w:rPr>
           <w:highlight w:val="yellow"/>
         </w:rPr>
-        <w:t>&gt;(Jean Michel BERLANDIER)&lt;/</w:t>
-      </w:r>
-      <w:proofErr w:type="spellStart"/>
-      <w:r>
-        <w:rPr>
-          <w:highlight w:val="yellow"/>
-        </w:rPr>
-        <w:t>em</w:t>
-      </w:r>
-      <w:proofErr w:type="spellEnd"/>
-      <w:r>
-        <w:rPr>
-          <w:highlight w:val="yellow"/>
-        </w:rPr>
+        <w:t>&gt;(Jean Michel BERLANDIER)&lt;/em&gt;</w:t>
+      </w:r>
+    </w:p>
+    <w:p>
+      <w:pPr>
+        <w:pStyle w:val="Listing"/>
+      </w:pPr>
+      <w:r>
+        <w:t>&lt;</w:t>
+      </w:r>
+      <w:proofErr w:type="gramStart"/>
+      <w:r>
+        <w:t>br</w:t>
+      </w:r>
+      <w:proofErr w:type="gramEnd"/>
+      <w:r>
+        <w:t>&gt;&lt;br class="separateur"&gt;&lt;br &gt;</w:t>
+      </w:r>
+    </w:p>
+    <w:p>
+      <w:pPr>
+        <w:pStyle w:val="Listing"/>
+      </w:pPr>
+      <w:r>
+        <w:t>&lt;</w:t>
+      </w:r>
+      <w:proofErr w:type="gramStart"/>
+      <w:r>
+        <w:t>ul</w:t>
+      </w:r>
+      <w:proofErr w:type="gramEnd"/>
+      <w:r>
         <w:t>&gt;</w:t>
       </w:r>
     </w:p>
@@ -1382,39 +958,13 @@
       <w:r>
         <w:t>&lt;</w:t>
       </w:r>
-      <w:proofErr w:type="spellStart"/>
-      <w:proofErr w:type="gramStart"/>
-      <w:r>
-        <w:t>br</w:t>
-      </w:r>
-      <w:proofErr w:type="spellEnd"/>
-      <w:proofErr w:type="gramEnd"/>
-      <w:r>
-        <w:t>&gt;&lt;</w:t>
-      </w:r>
-      <w:proofErr w:type="spellStart"/>
-      <w:r>
-        <w:t>br</w:t>
-      </w:r>
-      <w:proofErr w:type="spellEnd"/>
-      <w:r>
-        <w:t xml:space="preserve"> class="</w:t>
-      </w:r>
-      <w:proofErr w:type="spellStart"/>
-      <w:r>
-        <w:t>separateur</w:t>
-      </w:r>
-      <w:proofErr w:type="spellEnd"/>
-      <w:r>
-        <w:t>"&gt;&lt;</w:t>
-      </w:r>
-      <w:proofErr w:type="spellStart"/>
-      <w:r>
-        <w:t>br</w:t>
-      </w:r>
-      <w:proofErr w:type="spellEnd"/>
-      <w:r>
-        <w:t xml:space="preserve"> &gt;</w:t>
+      <w:proofErr w:type="gramStart"/>
+      <w:r>
+        <w:t>li</w:t>
+      </w:r>
+      <w:proofErr w:type="gramEnd"/>
+      <w:r>
+        <w:t>&gt;Né le&amp;nbsp;8&amp;nbsp;mars&amp;nbsp;1735 (mardi) - Boulbon (13017)&lt;/li&gt;</w:t>
       </w:r>
     </w:p>
     <w:p>
@@ -1424,15 +974,26 @@
       <w:r>
         <w:t>&lt;</w:t>
       </w:r>
-      <w:proofErr w:type="spellStart"/>
-      <w:proofErr w:type="gramStart"/>
-      <w:r>
-        <w:t>ul</w:t>
-      </w:r>
-      <w:proofErr w:type="spellEnd"/>
-      <w:proofErr w:type="gramEnd"/>
-      <w:r>
-        <w:t>&gt;</w:t>
+      <w:proofErr w:type="gramStart"/>
+      <w:r>
+        <w:t>li</w:t>
+      </w:r>
+      <w:proofErr w:type="gramEnd"/>
+      <w:r>
+        <w:t>&gt;Décédé le&amp;nbsp;30&amp;nbsp;thermidor&amp;nbsp;an&amp;nbsp;X  (18 août 1802) (mercredi) - Boulbon (13017),</w:t>
+      </w:r>
+    </w:p>
+    <w:p>
+      <w:pPr>
+        <w:pStyle w:val="Listing"/>
+      </w:pPr>
+      <w:proofErr w:type="gramStart"/>
+      <w:r>
+        <w:t>à</w:t>
+      </w:r>
+      <w:proofErr w:type="gramEnd"/>
+      <w:r>
+        <w:t xml:space="preserve"> l'âge de 67 ans&lt;/li&gt;</w:t>
       </w:r>
     </w:p>
     <w:p>
@@ -1448,51 +1009,6 @@
       </w:r>
       <w:proofErr w:type="gramEnd"/>
       <w:r>
-        <w:t>&gt;Né le&amp;nbsp;8&amp;nbsp;mars&amp;nbsp;1735 (mardi) - Boulbon (13017)&lt;/li&gt;</w:t>
-      </w:r>
-    </w:p>
-    <w:p>
-      <w:pPr>
-        <w:pStyle w:val="Listing"/>
-      </w:pPr>
-      <w:r>
-        <w:t>&lt;</w:t>
-      </w:r>
-      <w:proofErr w:type="gramStart"/>
-      <w:r>
-        <w:t>li</w:t>
-      </w:r>
-      <w:proofErr w:type="gramEnd"/>
-      <w:r>
-        <w:t>&gt;Décédé le&amp;nbsp;30&amp;nbsp;thermidor&amp;nbsp;an&amp;nbsp;X  (18 août 1802) (mercredi) - Boulbon (13017),</w:t>
-      </w:r>
-    </w:p>
-    <w:p>
-      <w:pPr>
-        <w:pStyle w:val="Listing"/>
-      </w:pPr>
-      <w:proofErr w:type="gramStart"/>
-      <w:r>
-        <w:t>à</w:t>
-      </w:r>
-      <w:proofErr w:type="gramEnd"/>
-      <w:r>
-        <w:t xml:space="preserve"> l'âge de 67 ans&lt;/li&gt;</w:t>
-      </w:r>
-    </w:p>
-    <w:p>
-      <w:pPr>
-        <w:pStyle w:val="Listing"/>
-      </w:pPr>
-      <w:r>
-        <w:t>&lt;</w:t>
-      </w:r>
-      <w:proofErr w:type="gramStart"/>
-      <w:r>
-        <w:t>li</w:t>
-      </w:r>
-      <w:proofErr w:type="gramEnd"/>
-      <w:r>
         <w:t>&gt;Meunier&lt;/li&gt;</w:t>
       </w:r>
     </w:p>
@@ -1501,15 +1017,7 @@
         <w:pStyle w:val="Listing"/>
       </w:pPr>
       <w:r>
-        <w:t>&lt;/</w:t>
-      </w:r>
-      <w:proofErr w:type="spellStart"/>
-      <w:r>
-        <w:t>ul</w:t>
-      </w:r>
-      <w:proofErr w:type="spellEnd"/>
-      <w:r>
-        <w:t>&gt;</w:t>
+        <w:t>&lt;/ul&gt;</w:t>
       </w:r>
     </w:p>
     <w:p/>
@@ -2641,7 +2149,6 @@
           <w:szCs w:val="18"/>
         </w:rPr>
       </w:pPr>
-      <w:proofErr w:type="spellStart"/>
       <w:proofErr w:type="gramStart"/>
       <w:r>
         <w:rPr>
@@ -2652,7 +2159,6 @@
         </w:rPr>
         <w:t>grep</w:t>
       </w:r>
-      <w:proofErr w:type="spellEnd"/>
       <w:proofErr w:type="gramEnd"/>
       <w:r>
         <w:rPr>
@@ -2661,27 +2167,7 @@
           <w:sz w:val="18"/>
           <w:szCs w:val="18"/>
         </w:rPr>
-        <w:t xml:space="preserve"> 'rubrique=' </w:t>
-      </w:r>
-      <w:proofErr w:type="spellStart"/>
-      <w:r>
-        <w:rPr>
-          <w:rFonts w:ascii="Lucida Console" w:hAnsi="Lucida Console" w:cs="Lucida Console"/>
-          <w:kern w:val="0"/>
-          <w:sz w:val="18"/>
-          <w:szCs w:val="18"/>
-        </w:rPr>
-        <w:t>result</w:t>
-      </w:r>
-      <w:proofErr w:type="spellEnd"/>
-      <w:r>
-        <w:rPr>
-          <w:rFonts w:ascii="Lucida Console" w:hAnsi="Lucida Console" w:cs="Lucida Console"/>
-          <w:kern w:val="0"/>
-          <w:sz w:val="18"/>
-          <w:szCs w:val="18"/>
-        </w:rPr>
-        <w:t>/*.log</w:t>
+        <w:t xml:space="preserve"> 'rubrique=' result/*.log</w:t>
       </w:r>
     </w:p>
     <w:p>
@@ -2697,23 +2183,7 @@
       </w:r>
       <w:proofErr w:type="gramEnd"/>
       <w:r>
-        <w:t xml:space="preserve">=brincat.oc=0.p=maria+anna.log:[geneanet] DEBUG: </w:t>
-      </w:r>
-      <w:proofErr w:type="spellStart"/>
-      <w:r>
-        <w:t>Generation</w:t>
-      </w:r>
-      <w:proofErr w:type="spellEnd"/>
-      <w:r>
-        <w:t xml:space="preserve"> 4, </w:t>
-      </w:r>
-      <w:proofErr w:type="spellStart"/>
-      <w:r>
-        <w:t>sosa</w:t>
-      </w:r>
-      <w:proofErr w:type="spellEnd"/>
-      <w:r>
-        <w:t xml:space="preserve"> 10 : Salvatore ATTARD : rubrique='Parents'</w:t>
+        <w:t>=brincat.oc=0.p=maria+anna.log:[geneanet] DEBUG: Generation 4, sosa 10 : Salvatore ATTARD : rubrique='Parents'</w:t>
       </w:r>
     </w:p>
     <w:p>
@@ -2729,23 +2199,7 @@
       </w:r>
       <w:proofErr w:type="gramEnd"/>
       <w:r>
-        <w:t xml:space="preserve">=brincat.oc=0.p=maria+anna.log:[geneanet] DEBUG: </w:t>
-      </w:r>
-      <w:proofErr w:type="spellStart"/>
-      <w:r>
-        <w:t>Generation</w:t>
-      </w:r>
-      <w:proofErr w:type="spellEnd"/>
-      <w:r>
-        <w:t xml:space="preserve"> 4, </w:t>
-      </w:r>
-      <w:proofErr w:type="spellStart"/>
-      <w:r>
-        <w:t>sosa</w:t>
-      </w:r>
-      <w:proofErr w:type="spellEnd"/>
-      <w:r>
-        <w:t xml:space="preserve"> 10 : Salvatore ATTARD : rubrique='Union(s), enfant(s)'</w:t>
+        <w:t>=brincat.oc=0.p=maria+anna.log:[geneanet] DEBUG: Generation 4, sosa 10 : Salvatore ATTARD : rubrique='Union(s), enfant(s)'</w:t>
       </w:r>
     </w:p>
     <w:p>
@@ -2761,23 +2215,7 @@
       </w:r>
       <w:proofErr w:type="gramEnd"/>
       <w:r>
-        <w:t xml:space="preserve">=brincat.oc=0.p=maria+anna.log:[geneanet] DEBUG: </w:t>
-      </w:r>
-      <w:proofErr w:type="spellStart"/>
-      <w:r>
-        <w:t>Generation</w:t>
-      </w:r>
-      <w:proofErr w:type="spellEnd"/>
-      <w:r>
-        <w:t xml:space="preserve"> 4, </w:t>
-      </w:r>
-      <w:proofErr w:type="spellStart"/>
-      <w:r>
-        <w:t>sosa</w:t>
-      </w:r>
-      <w:proofErr w:type="spellEnd"/>
-      <w:r>
-        <w:t xml:space="preserve"> 10 : Salvatore ATTARD : </w:t>
+        <w:t xml:space="preserve">=brincat.oc=0.p=maria+anna.log:[geneanet] DEBUG: Generation 4, sosa 10 : Salvatore ATTARD : </w:t>
       </w:r>
       <w:r>
         <w:rPr>
@@ -2800,23 +2238,7 @@
       </w:r>
       <w:proofErr w:type="gramEnd"/>
       <w:r>
-        <w:t xml:space="preserve">=brincat.oc=0.p=maria+anna.log:[geneanet] DEBUG: </w:t>
-      </w:r>
-      <w:proofErr w:type="spellStart"/>
-      <w:r>
-        <w:t>Generation</w:t>
-      </w:r>
-      <w:proofErr w:type="spellEnd"/>
-      <w:r>
-        <w:t xml:space="preserve"> 4, </w:t>
-      </w:r>
-      <w:proofErr w:type="spellStart"/>
-      <w:r>
-        <w:t>sosa</w:t>
-      </w:r>
-      <w:proofErr w:type="spellEnd"/>
-      <w:r>
-        <w:t xml:space="preserve"> 10 : Salvatore ATTARD : </w:t>
+        <w:t xml:space="preserve">=brincat.oc=0.p=maria+anna.log:[geneanet] DEBUG: Generation 4, sosa 10 : Salvatore ATTARD : </w:t>
       </w:r>
       <w:r>
         <w:rPr>
@@ -2838,31 +2260,7 @@
       </w:r>
       <w:proofErr w:type="gramEnd"/>
       <w:r>
-        <w:t xml:space="preserve">=brincat.oc=0.p=maria+anna.log:[geneanet] DEBUG: </w:t>
-      </w:r>
-      <w:proofErr w:type="spellStart"/>
-      <w:r>
-        <w:t>Generation</w:t>
-      </w:r>
-      <w:proofErr w:type="spellEnd"/>
-      <w:r>
-        <w:t xml:space="preserve"> 4, </w:t>
-      </w:r>
-      <w:proofErr w:type="spellStart"/>
-      <w:r>
-        <w:t>sosa</w:t>
-      </w:r>
-      <w:proofErr w:type="spellEnd"/>
-      <w:r>
-        <w:t xml:space="preserve"> 10 : Salvatore ATTARD : rubrique='</w:t>
-      </w:r>
-      <w:proofErr w:type="spellStart"/>
-      <w:r>
-        <w:t>Grands parents</w:t>
-      </w:r>
-      <w:proofErr w:type="spellEnd"/>
-      <w:r>
-        <w:t xml:space="preserve"> paternels, oncles et tantes'</w:t>
+        <w:t>=brincat.oc=0.p=maria+anna.log:[geneanet] DEBUG: Generation 4, sosa 10 : Salvatore ATTARD : rubrique='Grands parents paternels, oncles et tantes'</w:t>
       </w:r>
     </w:p>
     <w:p>
@@ -2878,31 +2276,7 @@
       </w:r>
       <w:proofErr w:type="gramEnd"/>
       <w:r>
-        <w:t xml:space="preserve">=brincat.oc=0.p=maria+anna.log:[geneanet] DEBUG: </w:t>
-      </w:r>
-      <w:proofErr w:type="spellStart"/>
-      <w:r>
-        <w:t>Generation</w:t>
-      </w:r>
-      <w:proofErr w:type="spellEnd"/>
-      <w:r>
-        <w:t xml:space="preserve"> 4, </w:t>
-      </w:r>
-      <w:proofErr w:type="spellStart"/>
-      <w:r>
-        <w:t>sosa</w:t>
-      </w:r>
-      <w:proofErr w:type="spellEnd"/>
-      <w:r>
-        <w:t xml:space="preserve"> 10 : Salvatore ATTARD : rubrique='</w:t>
-      </w:r>
-      <w:proofErr w:type="spellStart"/>
-      <w:r>
-        <w:t>Grands parents</w:t>
-      </w:r>
-      <w:proofErr w:type="spellEnd"/>
-      <w:r>
-        <w:t xml:space="preserve"> maternels, oncles et tantes'</w:t>
+        <w:t>=brincat.oc=0.p=maria+anna.log:[geneanet] DEBUG: Generation 4, sosa 10 : Salvatore ATTARD : rubrique='Grands parents maternels, oncles et tantes'</w:t>
       </w:r>
     </w:p>
     <w:p>
@@ -2918,23 +2292,7 @@
       </w:r>
       <w:proofErr w:type="gramEnd"/>
       <w:r>
-        <w:t xml:space="preserve">=brincat.oc=0.p=maria+anna.log:[geneanet] DEBUG: </w:t>
-      </w:r>
-      <w:proofErr w:type="spellStart"/>
-      <w:r>
-        <w:t>Generation</w:t>
-      </w:r>
-      <w:proofErr w:type="spellEnd"/>
-      <w:r>
-        <w:t xml:space="preserve"> 4, </w:t>
-      </w:r>
-      <w:proofErr w:type="spellStart"/>
-      <w:r>
-        <w:t>sosa</w:t>
-      </w:r>
-      <w:proofErr w:type="spellEnd"/>
-      <w:r>
-        <w:t xml:space="preserve"> 10 : Salvatore ATTARD : rubrique='Photos &amp; documents'</w:t>
+        <w:t>=brincat.oc=0.p=maria+anna.log:[geneanet] DEBUG: Generation 4, sosa 10 : Salvatore ATTARD : rubrique='Photos &amp; documents'</w:t>
       </w:r>
     </w:p>
     <w:p>
@@ -2950,23 +2308,7 @@
       </w:r>
       <w:proofErr w:type="gramEnd"/>
       <w:r>
-        <w:t xml:space="preserve">=brincat.oc=0.p=maria+anna.log:[geneanet] DEBUG: </w:t>
-      </w:r>
-      <w:proofErr w:type="spellStart"/>
-      <w:r>
-        <w:t>Generation</w:t>
-      </w:r>
-      <w:proofErr w:type="spellEnd"/>
-      <w:r>
-        <w:t xml:space="preserve"> 4, </w:t>
-      </w:r>
-      <w:proofErr w:type="spellStart"/>
-      <w:r>
-        <w:t>sosa</w:t>
-      </w:r>
-      <w:proofErr w:type="spellEnd"/>
-      <w:r>
-        <w:t xml:space="preserve"> 10 : Salvatore ATTARD : rubrique='Aperçu de l'arbre'</w:t>
+        <w:t>=brincat.oc=0.p=maria+anna.log:[geneanet] DEBUG: Generation 4, sosa 10 : Salvatore ATTARD : rubrique='Aperçu de l'arbre'</w:t>
       </w:r>
     </w:p>
     <w:p>
@@ -3055,7 +2397,6 @@
         </w:rPr>
         <w:t>&gt;&lt;</w:t>
       </w:r>
-      <w:proofErr w:type="spellStart"/>
       <w:r>
         <w:rPr>
           <w:rStyle w:val="start-tag"/>
@@ -3063,63 +2404,58 @@
         </w:rPr>
         <w:t>span</w:t>
       </w:r>
-      <w:proofErr w:type="spellEnd"/>
       <w:r>
         <w:rPr>
           <w:rStyle w:val="start-tag"/>
           <w:rFonts w:eastAsiaTheme="majorEastAsia"/>
         </w:rPr>
-        <w:t xml:space="preserve"> class="</w:t>
-      </w:r>
-      <w:proofErr w:type="spellStart"/>
+        <w:t xml:space="preserve"> class="htitle"&gt;&amp;nbsp;&lt;/span&gt;&lt;</w:t>
+      </w:r>
       <w:r>
         <w:rPr>
           <w:rStyle w:val="start-tag"/>
           <w:rFonts w:eastAsiaTheme="majorEastAsia"/>
         </w:rPr>
-        <w:t>htitle</w:t>
-      </w:r>
-      <w:proofErr w:type="spellEnd"/>
+        <w:t>span</w:t>
+      </w:r>
       <w:r>
         <w:rPr>
           <w:rStyle w:val="start-tag"/>
           <w:rFonts w:eastAsiaTheme="majorEastAsia"/>
         </w:rPr>
-        <w:t>"&gt;&amp;</w:t>
-      </w:r>
-      <w:proofErr w:type="spellStart"/>
+        <w:t>&gt;Union(s), enfant(s)&lt;</w:t>
+      </w:r>
       <w:r>
         <w:rPr>
           <w:rStyle w:val="start-tag"/>
           <w:rFonts w:eastAsiaTheme="majorEastAsia"/>
         </w:rPr>
-        <w:t>nbsp</w:t>
-      </w:r>
-      <w:proofErr w:type="spellEnd"/>
+        <w:t>span</w:t>
+      </w:r>
       <w:r>
         <w:rPr>
           <w:rStyle w:val="start-tag"/>
           <w:rFonts w:eastAsiaTheme="majorEastAsia"/>
         </w:rPr>
-        <w:t>;&lt;/</w:t>
-      </w:r>
-      <w:proofErr w:type="spellStart"/>
-      <w:r>
+        <w:t xml:space="preserve"> style="font-size: 90%"&gt;, petits-enfants&lt;/span&gt;</w:t>
+      </w:r>
+    </w:p>
+    <w:p>
+      <w:pPr>
+        <w:pStyle w:val="Listing"/>
         <w:rPr>
           <w:rStyle w:val="start-tag"/>
           <w:rFonts w:eastAsiaTheme="majorEastAsia"/>
         </w:rPr>
-        <w:t>span</w:t>
-      </w:r>
-      <w:proofErr w:type="spellEnd"/>
+      </w:pPr>
       <w:r>
         <w:rPr>
           <w:rStyle w:val="start-tag"/>
           <w:rFonts w:eastAsiaTheme="majorEastAsia"/>
         </w:rPr>
-        <w:t>&gt;&lt;</w:t>
-      </w:r>
-      <w:proofErr w:type="spellStart"/>
+        <w:t>&lt;</w:t>
+      </w:r>
+      <w:proofErr w:type="gramStart"/>
       <w:r>
         <w:rPr>
           <w:rStyle w:val="start-tag"/>
@@ -3127,127 +2463,29 @@
         </w:rPr>
         <w:t>span</w:t>
       </w:r>
-      <w:proofErr w:type="spellEnd"/>
+      <w:proofErr w:type="gramEnd"/>
       <w:r>
         <w:rPr>
           <w:rStyle w:val="start-tag"/>
           <w:rFonts w:eastAsiaTheme="majorEastAsia"/>
         </w:rPr>
-        <w:t>&gt;Union(s), enfant(s)&lt;</w:t>
-      </w:r>
-      <w:proofErr w:type="spellStart"/>
-      <w:r>
+        <w:t xml:space="preserve"> style="font-size: 80%"&gt; et arrière-petits-enfants&lt;/span&gt;</w:t>
+      </w:r>
+    </w:p>
+    <w:p>
+      <w:pPr>
+        <w:pStyle w:val="Listing"/>
         <w:rPr>
           <w:rStyle w:val="start-tag"/>
           <w:rFonts w:eastAsiaTheme="majorEastAsia"/>
         </w:rPr>
-        <w:t>span</w:t>
-      </w:r>
-      <w:proofErr w:type="spellEnd"/>
+      </w:pPr>
       <w:r>
         <w:rPr>
           <w:rStyle w:val="start-tag"/>
           <w:rFonts w:eastAsiaTheme="majorEastAsia"/>
         </w:rPr>
-        <w:t xml:space="preserve"> style="font-size: 90%"&gt;, petits-enfants&lt;/</w:t>
-      </w:r>
-      <w:proofErr w:type="spellStart"/>
-      <w:r>
-        <w:rPr>
-          <w:rStyle w:val="start-tag"/>
-          <w:rFonts w:eastAsiaTheme="majorEastAsia"/>
-        </w:rPr>
-        <w:t>span</w:t>
-      </w:r>
-      <w:proofErr w:type="spellEnd"/>
-      <w:r>
-        <w:rPr>
-          <w:rStyle w:val="start-tag"/>
-          <w:rFonts w:eastAsiaTheme="majorEastAsia"/>
-        </w:rPr>
-        <w:t>&gt;</w:t>
-      </w:r>
-    </w:p>
-    <w:p>
-      <w:pPr>
-        <w:pStyle w:val="Listing"/>
-        <w:rPr>
-          <w:rStyle w:val="start-tag"/>
-          <w:rFonts w:eastAsiaTheme="majorEastAsia"/>
-        </w:rPr>
-      </w:pPr>
-      <w:r>
-        <w:rPr>
-          <w:rStyle w:val="start-tag"/>
-          <w:rFonts w:eastAsiaTheme="majorEastAsia"/>
-        </w:rPr>
-        <w:t>&lt;</w:t>
-      </w:r>
-      <w:proofErr w:type="spellStart"/>
-      <w:proofErr w:type="gramStart"/>
-      <w:r>
-        <w:rPr>
-          <w:rStyle w:val="start-tag"/>
-          <w:rFonts w:eastAsiaTheme="majorEastAsia"/>
-        </w:rPr>
-        <w:t>span</w:t>
-      </w:r>
-      <w:proofErr w:type="spellEnd"/>
-      <w:proofErr w:type="gramEnd"/>
-      <w:r>
-        <w:rPr>
-          <w:rStyle w:val="start-tag"/>
-          <w:rFonts w:eastAsiaTheme="majorEastAsia"/>
-        </w:rPr>
-        <w:t xml:space="preserve"> style="font-size: 80%"&gt; et arrière-petits-enfants&lt;/</w:t>
-      </w:r>
-      <w:proofErr w:type="spellStart"/>
-      <w:r>
-        <w:rPr>
-          <w:rStyle w:val="start-tag"/>
-          <w:rFonts w:eastAsiaTheme="majorEastAsia"/>
-        </w:rPr>
-        <w:t>span</w:t>
-      </w:r>
-      <w:proofErr w:type="spellEnd"/>
-      <w:r>
-        <w:rPr>
-          <w:rStyle w:val="start-tag"/>
-          <w:rFonts w:eastAsiaTheme="majorEastAsia"/>
-        </w:rPr>
-        <w:t>&gt;</w:t>
-      </w:r>
-    </w:p>
-    <w:p>
-      <w:pPr>
-        <w:pStyle w:val="Listing"/>
-        <w:rPr>
-          <w:rStyle w:val="start-tag"/>
-          <w:rFonts w:eastAsiaTheme="majorEastAsia"/>
-        </w:rPr>
-      </w:pPr>
-      <w:r>
-        <w:rPr>
-          <w:rStyle w:val="start-tag"/>
-          <w:rFonts w:eastAsiaTheme="majorEastAsia"/>
-        </w:rPr>
-        <w:t>&lt;/</w:t>
-      </w:r>
-      <w:proofErr w:type="spellStart"/>
-      <w:r>
-        <w:rPr>
-          <w:rStyle w:val="start-tag"/>
-          <w:rFonts w:eastAsiaTheme="majorEastAsia"/>
-        </w:rPr>
-        <w:t>span</w:t>
-      </w:r>
-      <w:proofErr w:type="spellEnd"/>
-      <w:r>
-        <w:rPr>
-          <w:rStyle w:val="start-tag"/>
-          <w:rFonts w:eastAsiaTheme="majorEastAsia"/>
-        </w:rPr>
-        <w:t>&gt;&lt;/h2&gt;</w:t>
+        <w:t>&lt;/span&gt;&lt;/h2&gt;</w:t>
       </w:r>
     </w:p>
     <w:p/>
@@ -3268,7 +2506,6 @@
           <w:szCs w:val="18"/>
         </w:rPr>
       </w:pPr>
-      <w:proofErr w:type="spellStart"/>
       <w:proofErr w:type="gramStart"/>
       <w:r>
         <w:rPr>
@@ -3279,7 +2516,6 @@
         </w:rPr>
         <w:t>grep</w:t>
       </w:r>
-      <w:proofErr w:type="spellEnd"/>
       <w:proofErr w:type="gramEnd"/>
       <w:r>
         <w:rPr>
@@ -3288,19 +2524,21 @@
           <w:sz w:val="18"/>
           <w:szCs w:val="18"/>
         </w:rPr>
-        <w:t xml:space="preserve"> 'rubrique=' </w:t>
-      </w:r>
-      <w:proofErr w:type="spellStart"/>
-      <w:r>
+        <w:t xml:space="preserve"> 'rubrique=' result/*.log | sed -e 's/.*rubrique=//g' | sort -u</w:t>
+      </w:r>
+    </w:p>
+    <w:p>
+      <w:pPr>
+        <w:autoSpaceDE w:val="0"/>
+        <w:autoSpaceDN w:val="0"/>
+        <w:adjustRightInd w:val="0"/>
         <w:rPr>
           <w:rFonts w:ascii="Lucida Console" w:hAnsi="Lucida Console" w:cs="Lucida Console"/>
           <w:kern w:val="0"/>
           <w:sz w:val="18"/>
           <w:szCs w:val="18"/>
         </w:rPr>
-        <w:t>result</w:t>
-      </w:r>
-      <w:proofErr w:type="spellEnd"/>
+      </w:pPr>
       <w:r>
         <w:rPr>
           <w:rFonts w:ascii="Lucida Console" w:hAnsi="Lucida Console" w:cs="Lucida Console"/>
@@ -3308,19 +2546,21 @@
           <w:sz w:val="18"/>
           <w:szCs w:val="18"/>
         </w:rPr>
-        <w:t xml:space="preserve">/*.log | </w:t>
-      </w:r>
-      <w:proofErr w:type="spellStart"/>
-      <w:r>
+        <w:t>'Aperçu de l'arbre'</w:t>
+      </w:r>
+    </w:p>
+    <w:p>
+      <w:pPr>
+        <w:autoSpaceDE w:val="0"/>
+        <w:autoSpaceDN w:val="0"/>
+        <w:adjustRightInd w:val="0"/>
         <w:rPr>
           <w:rFonts w:ascii="Lucida Console" w:hAnsi="Lucida Console" w:cs="Lucida Console"/>
           <w:kern w:val="0"/>
           <w:sz w:val="18"/>
           <w:szCs w:val="18"/>
         </w:rPr>
-        <w:t>sed</w:t>
-      </w:r>
-      <w:proofErr w:type="spellEnd"/>
+      </w:pPr>
       <w:r>
         <w:rPr>
           <w:rFonts w:ascii="Lucida Console" w:hAnsi="Lucida Console" w:cs="Lucida Console"/>
@@ -3328,7 +2568,7 @@
           <w:sz w:val="18"/>
           <w:szCs w:val="18"/>
         </w:rPr>
-        <w:t xml:space="preserve"> -e 's/.*rubrique=//g' | sort -u</w:t>
+        <w:t>'Demi-frères et demi-sœurs'</w:t>
       </w:r>
     </w:p>
     <w:p>
@@ -3350,7 +2590,7 @@
           <w:sz w:val="18"/>
           <w:szCs w:val="18"/>
         </w:rPr>
-        <w:t>'Aperçu de l'arbre'</w:t>
+        <w:t>'Fratrie'</w:t>
       </w:r>
     </w:p>
     <w:p>
@@ -3372,7 +2612,7 @@
           <w:sz w:val="18"/>
           <w:szCs w:val="18"/>
         </w:rPr>
-        <w:t>'Demi-frères et demi-sœurs'</w:t>
+        <w:t>'Grands parents maternels, oncles et tantes'</w:t>
       </w:r>
     </w:p>
     <w:p>
@@ -3394,91 +2634,7 @@
           <w:sz w:val="18"/>
           <w:szCs w:val="18"/>
         </w:rPr>
-        <w:t>'Fratrie'</w:t>
-      </w:r>
-    </w:p>
-    <w:p>
-      <w:pPr>
-        <w:autoSpaceDE w:val="0"/>
-        <w:autoSpaceDN w:val="0"/>
-        <w:adjustRightInd w:val="0"/>
-        <w:rPr>
-          <w:rFonts w:ascii="Lucida Console" w:hAnsi="Lucida Console" w:cs="Lucida Console"/>
-          <w:kern w:val="0"/>
-          <w:sz w:val="18"/>
-          <w:szCs w:val="18"/>
-        </w:rPr>
-      </w:pPr>
-      <w:r>
-        <w:rPr>
-          <w:rFonts w:ascii="Lucida Console" w:hAnsi="Lucida Console" w:cs="Lucida Console"/>
-          <w:kern w:val="0"/>
-          <w:sz w:val="18"/>
-          <w:szCs w:val="18"/>
-        </w:rPr>
-        <w:t>'</w:t>
-      </w:r>
-      <w:proofErr w:type="spellStart"/>
-      <w:r>
-        <w:rPr>
-          <w:rFonts w:ascii="Lucida Console" w:hAnsi="Lucida Console" w:cs="Lucida Console"/>
-          <w:kern w:val="0"/>
-          <w:sz w:val="18"/>
-          <w:szCs w:val="18"/>
-        </w:rPr>
-        <w:t>Grands parents</w:t>
-      </w:r>
-      <w:proofErr w:type="spellEnd"/>
-      <w:r>
-        <w:rPr>
-          <w:rFonts w:ascii="Lucida Console" w:hAnsi="Lucida Console" w:cs="Lucida Console"/>
-          <w:kern w:val="0"/>
-          <w:sz w:val="18"/>
-          <w:szCs w:val="18"/>
-        </w:rPr>
-        <w:t xml:space="preserve"> maternels, oncles et tantes'</w:t>
-      </w:r>
-    </w:p>
-    <w:p>
-      <w:pPr>
-        <w:autoSpaceDE w:val="0"/>
-        <w:autoSpaceDN w:val="0"/>
-        <w:adjustRightInd w:val="0"/>
-        <w:rPr>
-          <w:rFonts w:ascii="Lucida Console" w:hAnsi="Lucida Console" w:cs="Lucida Console"/>
-          <w:kern w:val="0"/>
-          <w:sz w:val="18"/>
-          <w:szCs w:val="18"/>
-        </w:rPr>
-      </w:pPr>
-      <w:r>
-        <w:rPr>
-          <w:rFonts w:ascii="Lucida Console" w:hAnsi="Lucida Console" w:cs="Lucida Console"/>
-          <w:kern w:val="0"/>
-          <w:sz w:val="18"/>
-          <w:szCs w:val="18"/>
-        </w:rPr>
-        <w:t>'</w:t>
-      </w:r>
-      <w:proofErr w:type="spellStart"/>
-      <w:r>
-        <w:rPr>
-          <w:rFonts w:ascii="Lucida Console" w:hAnsi="Lucida Console" w:cs="Lucida Console"/>
-          <w:kern w:val="0"/>
-          <w:sz w:val="18"/>
-          <w:szCs w:val="18"/>
-        </w:rPr>
-        <w:t>Grands parents</w:t>
-      </w:r>
-      <w:proofErr w:type="spellEnd"/>
-      <w:r>
-        <w:rPr>
-          <w:rFonts w:ascii="Lucida Console" w:hAnsi="Lucida Console" w:cs="Lucida Console"/>
-          <w:kern w:val="0"/>
-          <w:sz w:val="18"/>
-          <w:szCs w:val="18"/>
-        </w:rPr>
-        <w:t xml:space="preserve"> paternels, oncles et tantes'</w:t>
+        <w:t>'Grands parents paternels, oncles et tantes'</w:t>
       </w:r>
     </w:p>
     <w:p>
@@ -3710,6 +2866,501 @@
     <w:p/>
     <w:p/>
     <w:p>
+      <w:r>
+        <w:t>Reste à faire :</w:t>
+      </w:r>
+    </w:p>
+    <w:p>
+      <w:hyperlink r:id="rId55" w:history="1">
+        <w:r>
+          <w:rPr>
+            <w:rStyle w:val="Lienhypertexte"/>
+          </w:rPr>
+          <w:t>https://gw.geneanet.org/danielr13?lang=fr&amp;p=pierre&amp;n=bard&amp;oc=1</w:t>
+        </w:r>
+      </w:hyperlink>
+    </w:p>
+    <w:p>
+      <w:r>
+        <w:rPr>
+          <w:noProof/>
+        </w:rPr>
+        <w:drawing>
+          <wp:inline distT="0" distB="0" distL="0" distR="0" wp14:anchorId="38CE8F80" wp14:editId="676405FA">
+            <wp:extent cx="2695433" cy="424281"/>
+            <wp:effectExtent l="0" t="0" r="0" b="0"/>
+            <wp:docPr id="1367165125" name="Image 1367165125"/>
+            <wp:cNvGraphicFramePr>
+              <a:graphicFrameLocks xmlns:a="http://schemas.openxmlformats.org/drawingml/2006/main" noChangeAspect="1"/>
+            </wp:cNvGraphicFramePr>
+            <a:graphic xmlns:a="http://schemas.openxmlformats.org/drawingml/2006/main">
+              <a:graphicData uri="http://schemas.openxmlformats.org/drawingml/2006/picture">
+                <pic:pic xmlns:pic="http://schemas.openxmlformats.org/drawingml/2006/picture">
+                  <pic:nvPicPr>
+                    <pic:cNvPr id="1026392567" name=""/>
+                    <pic:cNvPicPr/>
+                  </pic:nvPicPr>
+                  <pic:blipFill>
+                    <a:blip r:embed="rId23"/>
+                    <a:stretch>
+                      <a:fillRect/>
+                    </a:stretch>
+                  </pic:blipFill>
+                  <pic:spPr>
+                    <a:xfrm>
+                      <a:off x="0" y="0"/>
+                      <a:ext cx="2708008" cy="426260"/>
+                    </a:xfrm>
+                    <a:prstGeom prst="rect">
+                      <a:avLst/>
+                    </a:prstGeom>
+                  </pic:spPr>
+                </pic:pic>
+              </a:graphicData>
+            </a:graphic>
+          </wp:inline>
+        </w:drawing>
+      </w:r>
+    </w:p>
+    <w:p/>
+    <w:p>
+      <w:r>
+        <w:t>Pb source mariage</w:t>
+      </w:r>
+    </w:p>
+    <w:p>
+      <w:r>
+        <w:t>Titre :</w:t>
+      </w:r>
+    </w:p>
+    <w:p>
+      <w:r>
+        <w:rPr>
+          <w:noProof/>
+        </w:rPr>
+        <w:lastRenderedPageBreak/>
+        <w:drawing>
+          <wp:inline distT="0" distB="0" distL="0" distR="0" wp14:anchorId="43E57DAA" wp14:editId="5612B062">
+            <wp:extent cx="2551587" cy="1869743"/>
+            <wp:effectExtent l="0" t="0" r="1270" b="0"/>
+            <wp:docPr id="1747408820" name="Image 1"/>
+            <wp:cNvGraphicFramePr>
+              <a:graphicFrameLocks xmlns:a="http://schemas.openxmlformats.org/drawingml/2006/main" noChangeAspect="1"/>
+            </wp:cNvGraphicFramePr>
+            <a:graphic xmlns:a="http://schemas.openxmlformats.org/drawingml/2006/main">
+              <a:graphicData uri="http://schemas.openxmlformats.org/drawingml/2006/picture">
+                <pic:pic xmlns:pic="http://schemas.openxmlformats.org/drawingml/2006/picture">
+                  <pic:nvPicPr>
+                    <pic:cNvPr id="1747408820" name=""/>
+                    <pic:cNvPicPr/>
+                  </pic:nvPicPr>
+                  <pic:blipFill>
+                    <a:blip r:embed="rId56"/>
+                    <a:stretch>
+                      <a:fillRect/>
+                    </a:stretch>
+                  </pic:blipFill>
+                  <pic:spPr>
+                    <a:xfrm>
+                      <a:off x="0" y="0"/>
+                      <a:ext cx="2558564" cy="1874856"/>
+                    </a:xfrm>
+                    <a:prstGeom prst="rect">
+                      <a:avLst/>
+                    </a:prstGeom>
+                  </pic:spPr>
+                </pic:pic>
+              </a:graphicData>
+            </a:graphic>
+          </wp:inline>
+        </w:drawing>
+      </w:r>
+    </w:p>
+    <w:p>
+      <w:r>
+        <w:t>OK, si ce n’est qu’on a perdu note2 + source lors de l’import</w:t>
+      </w:r>
+    </w:p>
+    <w:p/>
+    <w:p/>
+    <w:p>
+      <w:r>
+        <w:t>Profession / Diplôme</w:t>
+      </w:r>
+    </w:p>
+    <w:p>
+      <w:r>
+        <w:t>Ref :</w:t>
+      </w:r>
+    </w:p>
+    <w:p>
+      <w:r>
+        <w:rPr>
+          <w:noProof/>
+        </w:rPr>
+        <w:drawing>
+          <wp:inline distT="0" distB="0" distL="0" distR="0" wp14:anchorId="1328D99E" wp14:editId="3DF3DAD8">
+            <wp:extent cx="2764134" cy="1867803"/>
+            <wp:effectExtent l="0" t="0" r="0" b="0"/>
+            <wp:docPr id="619263657" name="Image 1"/>
+            <wp:cNvGraphicFramePr>
+              <a:graphicFrameLocks xmlns:a="http://schemas.openxmlformats.org/drawingml/2006/main" noChangeAspect="1"/>
+            </wp:cNvGraphicFramePr>
+            <a:graphic xmlns:a="http://schemas.openxmlformats.org/drawingml/2006/main">
+              <a:graphicData uri="http://schemas.openxmlformats.org/drawingml/2006/picture">
+                <pic:pic xmlns:pic="http://schemas.openxmlformats.org/drawingml/2006/picture">
+                  <pic:nvPicPr>
+                    <pic:cNvPr id="619263657" name=""/>
+                    <pic:cNvPicPr/>
+                  </pic:nvPicPr>
+                  <pic:blipFill>
+                    <a:blip r:embed="rId57"/>
+                    <a:stretch>
+                      <a:fillRect/>
+                    </a:stretch>
+                  </pic:blipFill>
+                  <pic:spPr>
+                    <a:xfrm>
+                      <a:off x="0" y="0"/>
+                      <a:ext cx="2778064" cy="1877216"/>
+                    </a:xfrm>
+                    <a:prstGeom prst="rect">
+                      <a:avLst/>
+                    </a:prstGeom>
+                  </pic:spPr>
+                </pic:pic>
+              </a:graphicData>
+            </a:graphic>
+          </wp:inline>
+        </w:drawing>
+      </w:r>
+      <w:r>
+        <w:rPr>
+          <w:noProof/>
+        </w:rPr>
+        <w:drawing>
+          <wp:inline distT="0" distB="0" distL="0" distR="0" wp14:anchorId="65266CA2" wp14:editId="3017AD32">
+            <wp:extent cx="2436126" cy="1869332"/>
+            <wp:effectExtent l="0" t="0" r="2540" b="0"/>
+            <wp:docPr id="2018039012" name="Image 1"/>
+            <wp:cNvGraphicFramePr>
+              <a:graphicFrameLocks xmlns:a="http://schemas.openxmlformats.org/drawingml/2006/main" noChangeAspect="1"/>
+            </wp:cNvGraphicFramePr>
+            <a:graphic xmlns:a="http://schemas.openxmlformats.org/drawingml/2006/main">
+              <a:graphicData uri="http://schemas.openxmlformats.org/drawingml/2006/picture">
+                <pic:pic xmlns:pic="http://schemas.openxmlformats.org/drawingml/2006/picture">
+                  <pic:nvPicPr>
+                    <pic:cNvPr id="2018039012" name=""/>
+                    <pic:cNvPicPr/>
+                  </pic:nvPicPr>
+                  <pic:blipFill>
+                    <a:blip r:embed="rId58"/>
+                    <a:stretch>
+                      <a:fillRect/>
+                    </a:stretch>
+                  </pic:blipFill>
+                  <pic:spPr>
+                    <a:xfrm>
+                      <a:off x="0" y="0"/>
+                      <a:ext cx="2446399" cy="1877215"/>
+                    </a:xfrm>
+                    <a:prstGeom prst="rect">
+                      <a:avLst/>
+                    </a:prstGeom>
+                  </pic:spPr>
+                </pic:pic>
+              </a:graphicData>
+            </a:graphic>
+          </wp:inline>
+        </w:drawing>
+      </w:r>
+    </w:p>
+    <w:p>
+      <w:hyperlink r:id="rId59" w:history="1">
+        <w:r>
+          <w:rPr>
+            <w:rStyle w:val="Lienhypertexte"/>
+          </w:rPr>
+          <w:t>https://gw.geneanet.org/nraibaut2?lang=fr&amp;n=dupont&amp;oc=0&amp;p=gerard</w:t>
+        </w:r>
+      </w:hyperlink>
+    </w:p>
+    <w:p/>
+    <w:p>
+      <w:r>
+        <w:t>1 OCCU Profession de Gérard</w:t>
+      </w:r>
+    </w:p>
+    <w:p>
+      <w:r>
+        <w:t>2 NOTE @N00005@</w:t>
+      </w:r>
+    </w:p>
+    <w:p>
+      <w:r>
+        <w:t>2 SOUR @S00005@</w:t>
+      </w:r>
+    </w:p>
+    <w:p/>
+    <w:p>
+      <w:r>
+        <w:t>1 GRAD</w:t>
+      </w:r>
+    </w:p>
+    <w:p>
+      <w:r>
+        <w:t>2 TYPE Certificat d'études</w:t>
+      </w:r>
+    </w:p>
+    <w:p>
+      <w:r>
+        <w:t>2 DATE 1 JUL 1891</w:t>
+      </w:r>
+    </w:p>
+    <w:p>
+      <w:r>
+        <w:t>2 PLAC Nice, FRANCE</w:t>
+      </w:r>
+    </w:p>
+    <w:p>
+      <w:r>
+        <w:lastRenderedPageBreak/>
+        <w:t>2 NOTE @N00014@</w:t>
+      </w:r>
+    </w:p>
+    <w:p>
+      <w:r>
+        <w:t>2 SOUR @S00010@</w:t>
+      </w:r>
+    </w:p>
+    <w:p/>
+    <w:p>
+      <w:proofErr w:type="gramStart"/>
+      <w:r>
+        <w:t>actuellement</w:t>
+      </w:r>
+      <w:proofErr w:type="gramEnd"/>
+      <w:r>
+        <w:t> :</w:t>
+      </w:r>
+    </w:p>
+    <w:p>
+      <w:r>
+        <w:t>1 OCCU</w:t>
+      </w:r>
+    </w:p>
+    <w:p>
+      <w:r>
+        <w:t>2 DATE 18 MAY 1882</w:t>
+      </w:r>
+    </w:p>
+    <w:p>
+      <w:r>
+        <w:t>2 NOTE @N00007@</w:t>
+      </w:r>
+    </w:p>
+    <w:p>
+      <w:r>
+        <w:t>2 SOUR @S00005@</w:t>
+      </w:r>
+    </w:p>
+    <w:p>
+      <w:r>
+        <w:t xml:space="preserve">0 @N00007@ NOTE Profession de Gérard  </w:t>
+      </w:r>
+    </w:p>
+    <w:p>
+      <w:r>
+        <w:t xml:space="preserve">1 CONT Note1 sur la profession  </w:t>
+      </w:r>
+    </w:p>
+    <w:p>
+      <w:r>
+        <w:t>1 CONT Note2 sur la profession</w:t>
+      </w:r>
+    </w:p>
+    <w:p>
+      <w:r>
+        <w:t>0 @S00005@ SOUR</w:t>
+      </w:r>
+    </w:p>
+    <w:p>
+      <w:r>
+        <w:t>1 TITL &lt;https://www.source_profession.fr/&gt;</w:t>
+      </w:r>
+    </w:p>
+    <w:p>
+      <w:r>
+        <w:t>1 TEXT Texte1 source profession</w:t>
+      </w:r>
+    </w:p>
+    <w:p>
+      <w:r>
+        <w:t>2 CONT Texte2 source profession</w:t>
+      </w:r>
+    </w:p>
+    <w:p/>
+    <w:p/>
+    <w:p>
+      <w:r>
+        <w:t>1 GRAD</w:t>
+      </w:r>
+    </w:p>
+    <w:p>
+      <w:r>
+        <w:t>2 DATE 1 JUL 1891</w:t>
+      </w:r>
+    </w:p>
+    <w:p>
+      <w:r>
+        <w:t>2 PLAC Nice, FRANCE</w:t>
+      </w:r>
+    </w:p>
+    <w:p>
+      <w:r>
+        <w:t>2 NOTE @N00009@</w:t>
+      </w:r>
+    </w:p>
+    <w:p>
+      <w:r>
+        <w:t>2 SOUR @S00007@</w:t>
+      </w:r>
+    </w:p>
+    <w:p>
+      <w:r>
+        <w:t xml:space="preserve">0 @N00009@ NOTE Certificat d'études  </w:t>
+      </w:r>
+    </w:p>
+    <w:p>
+      <w:r>
+        <w:t xml:space="preserve">1 CONT Note1 sur diplôme  </w:t>
+      </w:r>
+    </w:p>
+    <w:p>
+      <w:r>
+        <w:t>1 CONT Note2 sur diplôme</w:t>
+      </w:r>
+    </w:p>
+    <w:p/>
+    <w:p/>
+    <w:p>
+      <w:r>
+        <w:t xml:space="preserve">            # @todo tag TYP (cas GRAD (diplôme)) : voir si ça vaut le coup de l'extraire de la 1ère ligne des notes</w:t>
+      </w:r>
+      <w:r>
+        <w:t xml:space="preserve"> </w:t>
+      </w:r>
+      <w:r>
+        <w:rPr>
+          <w:rFonts w:cs="Arial"/>
+        </w:rPr>
+        <w:sym w:font="Wingdings" w:char="F0E8"/>
+      </w:r>
+      <w:r>
+        <w:rPr>
+          <w:rFonts w:cs="Arial"/>
+        </w:rPr>
+        <w:t xml:space="preserve"> OK</w:t>
+      </w:r>
+    </w:p>
+    <w:p>
+      <w:r>
+        <w:t xml:space="preserve">            # @todo cas OCCU (profession) : voir si ça vaut le coup de l'extraire de la 1ère ligne des notes</w:t>
+      </w:r>
+      <w:r>
+        <w:t xml:space="preserve"> </w:t>
+      </w:r>
+      <w:r>
+        <w:rPr>
+          <w:rFonts w:cs="Arial"/>
+        </w:rPr>
+        <w:sym w:font="Wingdings" w:char="F0E8"/>
+      </w:r>
+      <w:r>
+        <w:rPr>
+          <w:rFonts w:cs="Arial"/>
+        </w:rPr>
+        <w:t xml:space="preserve"> OK</w:t>
+      </w:r>
+    </w:p>
+    <w:p>
+      <w:pPr>
+        <w:rPr>
+          <w:rFonts w:cs="Arial"/>
+        </w:rPr>
+      </w:pPr>
+      <w:r>
+        <w:t xml:space="preserve">            # @todo espaces en fin de lignes des notes événements</w:t>
+      </w:r>
+      <w:r>
+        <w:t xml:space="preserve"> </w:t>
+      </w:r>
+      <w:r>
+        <w:rPr>
+          <w:rFonts w:cs="Arial"/>
+        </w:rPr>
+        <w:sym w:font="Wingdings" w:char="F0E8"/>
+      </w:r>
+      <w:r>
+        <w:rPr>
+          <w:rFonts w:cs="Arial"/>
+        </w:rPr>
+        <w:t xml:space="preserve"> OK</w:t>
+      </w:r>
+    </w:p>
+    <w:p>
+      <w:pPr>
+        <w:rPr>
+          <w:rFonts w:cs="Arial"/>
+        </w:rPr>
+      </w:pPr>
+    </w:p>
+    <w:p>
+      <w:pPr>
+        <w:rPr>
+          <w:rFonts w:cs="Arial"/>
+        </w:rPr>
+      </w:pPr>
+    </w:p>
+    <w:p>
+      <w:pPr>
+        <w:rPr>
+          <w:rFonts w:cs="Arial"/>
+        </w:rPr>
+      </w:pPr>
+      <w:r>
+        <w:rPr>
+          <w:rFonts w:cs="Arial"/>
+        </w:rPr>
+        <w:t>Ménage des @todo autour du mariage :</w:t>
+      </w:r>
+    </w:p>
+    <w:p>
+      <w:pPr>
+        <w:rPr>
+          <w:rFonts w:cs="Arial"/>
+        </w:rPr>
+      </w:pPr>
+      <w:r>
+        <w:rPr>
+          <w:rFonts w:cs="Arial"/>
+        </w:rPr>
+        <w:t>2 cas « </w:t>
+      </w:r>
+      <w:r>
+        <w:rPr>
+          <w:rFonts w:cs="Arial"/>
+        </w:rPr>
+        <w:t>événement contrat de mariage</w:t>
+      </w:r>
+      <w:r>
+        <w:rPr>
+          <w:rFonts w:cs="Arial"/>
+        </w:rPr>
+        <w:t> » (ignorés)</w:t>
+      </w:r>
+    </w:p>
+    <w:p>
       <w:pPr>
         <w:autoSpaceDE w:val="0"/>
         <w:autoSpaceDN w:val="0"/>
@@ -3721,26 +3372,150 @@
           <w:szCs w:val="18"/>
         </w:rPr>
       </w:pPr>
-    </w:p>
-    <w:p>
-      <w:pPr>
-        <w:autoSpaceDE w:val="0"/>
-        <w:autoSpaceDN w:val="0"/>
-        <w:adjustRightInd w:val="0"/>
+      <w:proofErr w:type="gramStart"/>
+      <w:r>
         <w:rPr>
           <w:rFonts w:ascii="Lucida Console" w:hAnsi="Lucida Console" w:cs="Lucida Console"/>
           <w:kern w:val="0"/>
           <w:sz w:val="18"/>
           <w:szCs w:val="18"/>
         </w:rPr>
-      </w:pPr>
-    </w:p>
-    <w:p/>
-    <w:p/>
-    <w:p/>
+        <w:t>grep</w:t>
+      </w:r>
+      <w:proofErr w:type="gramEnd"/>
+      <w:r>
+        <w:rPr>
+          <w:rFonts w:ascii="Lucida Console" w:hAnsi="Lucida Console" w:cs="Lucida Console"/>
+          <w:kern w:val="0"/>
+          <w:sz w:val="18"/>
+          <w:szCs w:val="18"/>
+        </w:rPr>
+        <w:t xml:space="preserve"> 'événement contrat de mariage' result/*.log</w:t>
+      </w:r>
+    </w:p>
+    <w:p>
+      <w:pPr>
+        <w:autoSpaceDE w:val="0"/>
+        <w:autoSpaceDN w:val="0"/>
+        <w:adjustRightInd w:val="0"/>
+        <w:rPr>
+          <w:rFonts w:ascii="Lucida Console" w:hAnsi="Lucida Console" w:cs="Lucida Console"/>
+          <w:kern w:val="0"/>
+          <w:sz w:val="18"/>
+          <w:szCs w:val="18"/>
+        </w:rPr>
+      </w:pPr>
+      <w:r>
+        <w:rPr>
+          <w:rFonts w:ascii="Lucida Console" w:hAnsi="Lucida Console" w:cs="Lucida Console"/>
+          <w:kern w:val="0"/>
+          <w:sz w:val="18"/>
+          <w:szCs w:val="18"/>
+        </w:rPr>
+        <w:t>result/gw.geneanet.org.danielr13.lang=fr.n=</w:t>
+      </w:r>
+      <w:proofErr w:type="gramStart"/>
+      <w:r>
+        <w:rPr>
+          <w:rFonts w:ascii="Lucida Console" w:hAnsi="Lucida Console" w:cs="Lucida Console"/>
+          <w:kern w:val="0"/>
+          <w:sz w:val="18"/>
+          <w:szCs w:val="18"/>
+        </w:rPr>
+        <w:t>nicolas.oc=0.p</w:t>
+      </w:r>
+      <w:proofErr w:type="gramEnd"/>
+      <w:r>
+        <w:rPr>
+          <w:rFonts w:ascii="Lucida Console" w:hAnsi="Lucida Console" w:cs="Lucida Console"/>
+          <w:kern w:val="0"/>
+          <w:sz w:val="18"/>
+          <w:szCs w:val="18"/>
+        </w:rPr>
+        <w:t>=etienne+henri.log:[geneanet] DEBUG: Generation 9, sosa 429 : Magdeleine PERRIER : événement contrat de mariage 'Contrat de mariage (avec Jean LAMOUROUX)' : date='29 août 1666', place='Vallabrègues (30336)', notes='None', source='None'</w:t>
+      </w:r>
+    </w:p>
+    <w:p>
+      <w:pPr>
+        <w:autoSpaceDE w:val="0"/>
+        <w:autoSpaceDN w:val="0"/>
+        <w:adjustRightInd w:val="0"/>
+        <w:rPr>
+          <w:rFonts w:ascii="Lucida Console" w:hAnsi="Lucida Console" w:cs="Lucida Console"/>
+          <w:kern w:val="0"/>
+          <w:sz w:val="18"/>
+          <w:szCs w:val="18"/>
+        </w:rPr>
+      </w:pPr>
+      <w:r>
+        <w:rPr>
+          <w:rFonts w:ascii="Lucida Console" w:hAnsi="Lucida Console" w:cs="Lucida Console"/>
+          <w:kern w:val="0"/>
+          <w:sz w:val="18"/>
+          <w:szCs w:val="18"/>
+        </w:rPr>
+        <w:lastRenderedPageBreak/>
+        <w:t>result/gw.geneanet.org.danielr13.lang=fr.n=</w:t>
+      </w:r>
+      <w:proofErr w:type="gramStart"/>
+      <w:r>
+        <w:rPr>
+          <w:rFonts w:ascii="Lucida Console" w:hAnsi="Lucida Console" w:cs="Lucida Console"/>
+          <w:kern w:val="0"/>
+          <w:sz w:val="18"/>
+          <w:szCs w:val="18"/>
+        </w:rPr>
+        <w:t>nicolas.oc=0.p</w:t>
+      </w:r>
+      <w:proofErr w:type="gramEnd"/>
+      <w:r>
+        <w:rPr>
+          <w:rFonts w:ascii="Lucida Console" w:hAnsi="Lucida Console" w:cs="Lucida Console"/>
+          <w:kern w:val="0"/>
+          <w:sz w:val="18"/>
+          <w:szCs w:val="18"/>
+        </w:rPr>
+        <w:t>=etienne+henri.log:[geneanet] DEBUG: Generation 9, sosa 428 : Jean LAMOUROUX : événement contrat de mariage 'Contrat de mariage (avec Magdeleine PERRIER)' : date='29 août 1666', place='Vallabrègues (30336)', notes='None', source='None'</w:t>
+      </w:r>
+    </w:p>
+    <w:p>
+      <w:pPr>
+        <w:rPr>
+          <w:rFonts w:cs="Arial"/>
+        </w:rPr>
+      </w:pPr>
+      <w:proofErr w:type="gramStart"/>
+      <w:r>
+        <w:rPr>
+          <w:rFonts w:cs="Arial"/>
+        </w:rPr>
+        <w:t>traités</w:t>
+      </w:r>
+      <w:proofErr w:type="gramEnd"/>
+      <w:r>
+        <w:rPr>
+          <w:rFonts w:cs="Arial"/>
+        </w:rPr>
+        <w:t xml:space="preserve"> par note @todo</w:t>
+      </w:r>
+    </w:p>
+    <w:p>
+      <w:pPr>
+        <w:rPr>
+          <w:rFonts w:cs="Arial"/>
+        </w:rPr>
+      </w:pPr>
+    </w:p>
+    <w:p>
+      <w:pPr>
+        <w:rPr>
+          <w:rFonts w:cs="Arial"/>
+        </w:rPr>
+      </w:pPr>
+    </w:p>
     <w:p/>
     <w:sectPr>
-      <w:headerReference w:type="default" r:id="rId55"/>
+      <w:headerReference w:type="default" r:id="rId60"/>
       <w:pgSz w:w="16838" w:h="11906" w:orient="landscape"/>
       <w:pgMar w:top="1080" w:right="1440" w:bottom="1080" w:left="1440" w:header="708" w:footer="708" w:gutter="0"/>
       <w:cols w:space="708"/>
@@ -3822,7 +3597,7 @@
       <w:rPr>
         <w:noProof/>
       </w:rPr>
-      <w:t>17/08/2023</w:t>
+      <w:t>18/08/2023</w:t>
     </w:r>
     <w:r>
       <w:fldChar w:fldCharType="end"/>

</xml_diff>